<commit_message>
court(va): motion brief gated on the shared model, closing kept with the last paragraph (fb-595.54.35)
Co-Authored-By: Claude Opus 5.5 <noreply@anthropic.com>
</commit_message>
<xml_diff>
--- a/courts/fourth-circuit/virginia/state/supreme-court/motion-brief/usage/OUTPUT-motion-brief.docx
+++ b/courts/fourth-circuit/virginia/state/supreme-court/motion-brief/usage/OUTPUT-motion-brief.docx
@@ -1162,9 +1162,7 @@
         <w:t xml:space="preserve"> </w:t>
       </w:r>
       <w:r>
-        <w:t xml:space="preserve">53.1</w:t>
-        <w:noBreakHyphen/>
-        <w:t xml:space="preserve">202.3(A)</w:t>
+        <w:t xml:space="preserve">53.1-⁠202.3(A)</w:t>
       </w:r>
       <w:r>
         <w:t xml:space="preserve"> </w:t>
@@ -1396,9 +1394,7 @@
         <w:t xml:space="preserve"> </w:t>
       </w:r>
       <w:r>
-        <w:t xml:space="preserve">53.1</w:t>
-        <w:noBreakHyphen/>
-        <w:t xml:space="preserve">202.3(A)</w:t>
+        <w:t xml:space="preserve">53.1-⁠202.3(A)</w:t>
       </w:r>
       <w:r>
         <w:t xml:space="preserve"> </w:t>
@@ -3396,7 +3392,7 @@
         <w:t xml:space="preserve"> </w:t>
       </w:r>
       <w:r>
-        <w:t xml:space="preserve">https://lis.virginia.gov/​cgi-bin/​legp604.exe?202+ful+CHAP0050+pdf</w:t>
+        <w:t xml:space="preserve">https://​lis.​virginia.​gov/​cgi-​bin/​legp604.​exe?​202+ful+CHAP0050+pdf</w:t>
       </w:r>
       <w:r>
         <w:t xml:space="preserve">   </w:t>
@@ -3610,13 +3606,7 @@
         <w:pStyle w:val="BodyText"/>
       </w:pPr>
       <w:r>
-        <w:t xml:space="preserve">Petitioner is not eligible for enhanced good time credits for his convictions for attempted aggravated murder of a law enforcement officer. The Code of Virginia does not enumerate a separate offense for attempted aggravated murder. Rather, attempted aggravated murder constitutes a type of violation of the aggravated murder statute, for which the Code separately provides penalties. Thus, Code § 53.1</w:t>
-      </w:r>
-      <w:r>
-        <w:noBreakHyphen/>
-      </w:r>
-      <w:r>
-        <w:t xml:space="preserve">202.3(A)’s</w:t>
+        <w:t xml:space="preserve">Petitioner is not eligible for enhanced good time credits for his convictions for attempted aggravated murder of a law enforcement officer. The Code of Virginia does not enumerate a separate offense for attempted aggravated murder. Rather, attempted aggravated murder constitutes a type of violation of the aggravated murder statute, for which the Code separately provides penalties. Thus, Code § 53.1-⁠202.3(A)’s</w:t>
       </w:r>
       <w:r>
         <w:t xml:space="preserve"> </w:t>
@@ -3630,13 +3620,7 @@
         <w:pStyle w:val="BodyText"/>
       </w:pPr>
       <w:r>
-        <w:t xml:space="preserve">Petitioner’s interpretation, under which solicitation to commit murder would be ineligible for enhanced credits but attempts to murder would be eligible, is not a reasonable one and is not compelled by the text of the statute. Indeed, Petitioner makes no attempt to explain why the General Assembly would have intended such an irrational result, instead contending only that this Court must give effect to the statute’s plain text, even if “the legislature may have intended a different result.” Pet. at 20. But Petitioner’s strained reading of the text is not the correct one: subsection (A)’s plain text encompasses convictions for attempt as well as for the completed offense. Because Petitioner’s sentence includes a crime covered by subsection (A) of Code § 53.1</w:t>
-      </w:r>
-      <w:r>
-        <w:noBreakHyphen/>
-      </w:r>
-      <w:r>
-        <w:t xml:space="preserve">202.3,</w:t>
+        <w:t xml:space="preserve">Petitioner’s interpretation, under which solicitation to commit murder would be ineligible for enhanced credits but attempts to murder would be eligible, is not a reasonable one and is not compelled by the text of the statute. Indeed, Petitioner makes no attempt to explain why the General Assembly would have intended such an irrational result, instead contending only that this Court must give effect to the statute’s plain text, even if “the legislature may have intended a different result.” Pet. at 20. But Petitioner’s strained reading of the text is not the correct one: subsection (A)’s plain text encompasses convictions for attempt as well as for the completed offense. Because Petitioner’s sentence includes a crime covered by subsection (A) of Code § 53.1-⁠202.3,</w:t>
       </w:r>
       <w:r>
         <w:t xml:space="preserve"> </w:t>
@@ -3666,13 +3650,7 @@
         <w:pStyle w:val="BodyText"/>
       </w:pPr>
       <w:r>
-        <w:t xml:space="preserve">Pursuant to Code § 8.01</w:t>
-      </w:r>
-      <w:r>
-        <w:noBreakHyphen/>
-      </w:r>
-      <w:r>
-        <w:t xml:space="preserve">660</w:t>
+        <w:t xml:space="preserve">Pursuant to Code § 8.01-⁠660</w:t>
       </w:r>
       <w:r>
         <w:t xml:space="preserve"> </w:t>
@@ -3815,31 +3793,58 @@
         <w:t xml:space="preserve">Good Time Awards</w:t>
       </w:r>
       <w:r>
-        <w:t xml:space="preserve">. Different good time credit systems are available for different sentences, depending upon the date of the offense, and whether the offense is a felony or misdemeanor. And within each good time credit system, the inmate’s “class level” determines the rate at which the prisoner accrues good time credit. A prisoner is assigned a certain class level classification based on their institutional adjustment and behavior while incarcerated, with better performance earning a greater rate of credit accrual. Code §§ 53.1</w:t>
+        <w:t xml:space="preserve">. Different good time credit systems are available for different sentences, depending upon the date of the offense, and whether the offense is a felony or misdemeanor. And within each good time credit system, the inmate’s “class level” determines the rate at which the prisoner accrues good time credit. A prisoner is assigned a certain class level classification based on their institutional adjustment and behavior while incarcerated, with better performance earning a greater rate of credit accrual. Code §§ 53.1-⁠201;</w:t>
+      </w:r>
+      <w:r>
+        <w:t xml:space="preserve"> </w:t>
+      </w:r>
+      <w:r>
+        <w:t xml:space="preserve">53.1</w:t>
       </w:r>
       <w:r>
         <w:noBreakHyphen/>
       </w:r>
       <w:r>
-        <w:t xml:space="preserve">201;</w:t>
-      </w:r>
-      <w:r>
-        <w:t xml:space="preserve"> </w:t>
-      </w:r>
-      <w:r>
-        <w:t xml:space="preserve">53.1</w:t>
+        <w:t xml:space="preserve">202.3(B);</w:t>
+      </w:r>
+      <w:r>
+        <w:t xml:space="preserve"> </w:t>
+      </w:r>
+      <w:r>
+        <w:t xml:space="preserve">see also VDOC Operating Procedure 830.3,</w:t>
+      </w:r>
+      <w:r>
+        <w:t xml:space="preserve"> </w:t>
+      </w:r>
+      <w:r>
+        <w:rPr>
+          <w:i/>
+          <w:iCs/>
+        </w:rPr>
+        <w:t xml:space="preserve">Good Time Awards</w:t>
+      </w:r>
+      <w:r>
+        <w:t xml:space="preserve">. Shiflett Aff. ¶ 17, Enclosure F.</w:t>
+      </w:r>
+    </w:p>
+    <w:p>
+      <w:pPr>
+        <w:pStyle w:val="BodyText"/>
+      </w:pPr>
+      <w:r>
+        <w:t xml:space="preserve">For felony offenses committed prior to January 1, 1995, and misdemeanor offenses committed after July 1, 2008, Code §§ 53.1-⁠198 through 53.1</w:t>
       </w:r>
       <w:r>
         <w:noBreakHyphen/>
       </w:r>
       <w:r>
-        <w:t xml:space="preserve">202.3(B);</w:t>
-      </w:r>
-      <w:r>
-        <w:t xml:space="preserve"> </w:t>
-      </w:r>
-      <w:r>
-        <w:t xml:space="preserve">see also VDOC Operating Procedure 830.3,</w:t>
+        <w:t xml:space="preserve">202.1 establish the Good Conduct Allowance (GCA) system. Under the GCA system, the available class levels provide that an inmate may earn a maximum of 30 days of credit for every 30 days served to a minimum of 0 days of good time for every 30 days served. Code § 53.1-⁠201;</w:t>
+      </w:r>
+      <w:r>
+        <w:t xml:space="preserve"> </w:t>
+      </w:r>
+      <w:r>
+        <w:t xml:space="preserve">VDOC Operating Procedure 830.3,</w:t>
       </w:r>
       <w:r>
         <w:t xml:space="preserve"> </w:t>
@@ -3860,44 +3865,100 @@
         <w:pStyle w:val="BodyText"/>
       </w:pPr>
       <w:r>
-        <w:t xml:space="preserve">For felony offenses committed prior to January 1, 1995, and misdemeanor offenses committed after July 1, 2008, Code §§ 53.1</w:t>
+        <w:t xml:space="preserve">For felony offenses committed on or after January 1, 1995, Code §§ 53.1-⁠202.2 through 53.1</w:t>
       </w:r>
       <w:r>
         <w:noBreakHyphen/>
       </w:r>
       <w:r>
-        <w:t xml:space="preserve">198 through 53.1</w:t>
+        <w:t xml:space="preserve">202.4 establish the earned sentence credit (ESC) system. Prior to July 1, 2022, the maximum amount of credit that could be awarded per 30-day period served under the ESC system was 4.5 days. Code § 53.1-⁠202.3</w:t>
+      </w:r>
+      <w:r>
+        <w:t xml:space="preserve"> </w:t>
+      </w:r>
+      <w:r>
+        <w:t xml:space="preserve">(2021); VDOC Operating Procedure 830.3,</w:t>
+      </w:r>
+      <w:r>
+        <w:t xml:space="preserve"> </w:t>
+      </w:r>
+      <w:r>
+        <w:rPr>
+          <w:i/>
+          <w:iCs/>
+        </w:rPr>
+        <w:t xml:space="preserve">Good Time Awards</w:t>
+      </w:r>
+      <w:r>
+        <w:t xml:space="preserve">. Shiflett Aff. ¶ 17, Enclosure F.</w:t>
+      </w:r>
+    </w:p>
+    <w:p>
+      <w:pPr>
+        <w:pStyle w:val="BodyText"/>
+      </w:pPr>
+      <w:r>
+        <w:t xml:space="preserve">On July 1, 2022, however, House Bill 5148</w:t>
+      </w:r>
+      <w:r>
+        <w:t xml:space="preserve"> </w:t>
+      </w:r>
+      <w:r>
+        <w:t xml:space="preserve">amending Code § 53.1-⁠202.3</w:t>
+      </w:r>
+      <w:r>
+        <w:t xml:space="preserve"> </w:t>
+      </w:r>
+      <w:r>
+        <w:t xml:space="preserve">as it relates to the rates at which inmates can earn sentence credits for certain felony offenses became effective. 2020 Acts ch. 50 (Spec. Sess. I),</w:t>
+      </w:r>
+      <w:r>
+        <w:t xml:space="preserve"> </w:t>
+      </w:r>
+      <w:r>
+        <w:t xml:space="preserve">https://​lis.​virginia.​gov/​cgi-​bin/​legp604.​exe?​202+ful+CHAP0050+pdf. The amendments, which created a statutory four-tier class level system within the ESC system as well as a list of offenses exempt from that class level system, were intended to expand the availability of good time credits for less serious non-violent felonies, while leaving the prior system unchanged for more serious violent felonies.</w:t>
+      </w:r>
+      <w:r>
+        <w:t xml:space="preserve"> </w:t>
+      </w:r>
+      <w:r>
+        <w:rPr>
+          <w:i/>
+          <w:iCs/>
+        </w:rPr>
+        <w:t xml:space="preserve">Id.</w:t>
+      </w:r>
+    </w:p>
+    <w:p>
+      <w:pPr>
+        <w:pStyle w:val="BodyText"/>
+      </w:pPr>
+      <w:r>
+        <w:t xml:space="preserve">HB 5148 did not alter the prior maximum amount of sentence credits for felony sentences included in subsection (A) of section 53.1</w:t>
       </w:r>
       <w:r>
         <w:noBreakHyphen/>
       </w:r>
       <w:r>
-        <w:t xml:space="preserve">202.1 establish the Good Conduct Allowance (GCA) system. Under the GCA system, the available class levels provide that an inmate may earn a maximum of 30 days of credit for every 30 days served to a minimum of 0 days of good time for every 30 days served. Code § 53.1</w:t>
+        <w:t xml:space="preserve">202.3—4.5</w:t>
+      </w:r>
+      <w:r>
+        <w:t xml:space="preserve"> </w:t>
+      </w:r>
+      <w:r>
+        <w:t xml:space="preserve">days for every 30 days served (ESC</w:t>
       </w:r>
       <w:r>
         <w:noBreakHyphen/>
       </w:r>
       <w:r>
-        <w:t xml:space="preserve">201;</w:t>
-      </w:r>
-      <w:r>
-        <w:t xml:space="preserve"> </w:t>
-      </w:r>
-      <w:r>
-        <w:t xml:space="preserve">VDOC Operating Procedure 830.3,</w:t>
-      </w:r>
-      <w:r>
-        <w:t xml:space="preserve"> </w:t>
-      </w:r>
-      <w:r>
-        <w:rPr>
-          <w:i/>
-          <w:iCs/>
-        </w:rPr>
-        <w:t xml:space="preserve">Good Time Awards</w:t>
-      </w:r>
-      <w:r>
-        <w:t xml:space="preserve">. Shiflett Aff. ¶ 17, Enclosure F.</w:t>
+        <w:t xml:space="preserve">1 system). Code § 53.1-⁠202.3;</w:t>
+      </w:r>
+      <w:r>
+        <w:t xml:space="preserve"> </w:t>
+      </w:r>
+      <w:r>
+        <w:t xml:space="preserve">Shiflett Aff. ¶ 11, Enclosure F. The General Assembly chose to retain the previous maximum for the offenses included in subsection (A), which are more serious, primarily violent felonies such as murder, robbery, kidnapping, and rape. See Code § 53.1-⁠202.3(A)⁠(1)–⁠(17).</w:t>
       </w:r>
     </w:p>
     <w:p>
@@ -3905,178 +3966,35 @@
         <w:pStyle w:val="BodyText"/>
       </w:pPr>
       <w:r>
-        <w:t xml:space="preserve">For felony offenses committed on or after January 1, 1995, Code §§ 53.1</w:t>
+        <w:t xml:space="preserve">Inmates serving sentences for crimes</w:t>
+      </w:r>
+      <w:r>
+        <w:t xml:space="preserve"> </w:t>
+      </w:r>
+      <w:r>
+        <w:rPr>
+          <w:i/>
+          <w:iCs/>
+        </w:rPr>
+        <w:t xml:space="preserve">not</w:t>
+      </w:r>
+      <w:r>
+        <w:t xml:space="preserve"> </w:t>
+      </w:r>
+      <w:r>
+        <w:t xml:space="preserve">included in subsection (A), by contrast, are eligible to earn sentence credit under the new four-tier classification system set forth in subsection (B) and can earn a maximum of 15 days for every 30 days served (ESC</w:t>
       </w:r>
       <w:r>
         <w:noBreakHyphen/>
       </w:r>
       <w:r>
-        <w:t xml:space="preserve">202.2 through 53.1</w:t>
-      </w:r>
-      <w:r>
-        <w:noBreakHyphen/>
-      </w:r>
-      <w:r>
-        <w:t xml:space="preserve">202.4 establish the earned sentence credit (ESC) system. Prior to July 1, 2022, the maximum amount of credit that could be awarded per 30-day period served under the ESC system was 4.5 days. Code § 53.1</w:t>
-      </w:r>
-      <w:r>
-        <w:noBreakHyphen/>
-      </w:r>
-      <w:r>
-        <w:t xml:space="preserve">202.3</w:t>
-      </w:r>
-      <w:r>
-        <w:t xml:space="preserve"> </w:t>
-      </w:r>
-      <w:r>
-        <w:t xml:space="preserve">(2021); VDOC Operating Procedure 830.3,</w:t>
-      </w:r>
-      <w:r>
-        <w:t xml:space="preserve"> </w:t>
-      </w:r>
-      <w:r>
-        <w:rPr>
-          <w:i/>
-          <w:iCs/>
-        </w:rPr>
-        <w:t xml:space="preserve">Good Time Awards</w:t>
-      </w:r>
-      <w:r>
-        <w:t xml:space="preserve">. Shiflett Aff. ¶ 17, Enclosure F.</w:t>
-      </w:r>
-    </w:p>
-    <w:p>
-      <w:pPr>
-        <w:pStyle w:val="BodyText"/>
-      </w:pPr>
-      <w:r>
-        <w:t xml:space="preserve">On July 1, 2022, however, House Bill 5148</w:t>
-      </w:r>
-      <w:r>
-        <w:t xml:space="preserve"> </w:t>
-      </w:r>
-      <w:r>
-        <w:t xml:space="preserve">amending Code § 53.1</w:t>
-      </w:r>
-      <w:r>
-        <w:noBreakHyphen/>
-      </w:r>
-      <w:r>
-        <w:t xml:space="preserve">202.3</w:t>
-      </w:r>
-      <w:r>
-        <w:t xml:space="preserve"> </w:t>
-      </w:r>
-      <w:r>
-        <w:t xml:space="preserve">as it relates to the rates at which inmates can earn sentence credits for certain felony offenses became effective. 2020 Acts ch. 50 (Spec. Sess. I),</w:t>
-      </w:r>
-      <w:r>
-        <w:t xml:space="preserve"> </w:t>
-      </w:r>
-      <w:r>
-        <w:t xml:space="preserve">https://​lis.​virginia.​gov/​cgi-​bin/​legp604.​exe?202+ful+CHAP0050+pdf. The amendments, which created a statutory four-tier class level system within the ESC system as well as a list of offenses exempt from that class level system, were intended to expand the availability of good time credits for less serious non-violent felonies, while leaving the prior system unchanged for more serious violent felonies.</w:t>
-      </w:r>
-      <w:r>
-        <w:t xml:space="preserve"> </w:t>
-      </w:r>
-      <w:r>
-        <w:rPr>
-          <w:i/>
-          <w:iCs/>
-        </w:rPr>
-        <w:t xml:space="preserve">Id.</w:t>
-      </w:r>
-    </w:p>
-    <w:p>
-      <w:pPr>
-        <w:pStyle w:val="BodyText"/>
-      </w:pPr>
-      <w:r>
-        <w:t xml:space="preserve">HB 5148 did not alter the prior maximum amount of sentence credits for felony sentences included in subsection (A) of section 53.1</w:t>
-      </w:r>
-      <w:r>
-        <w:noBreakHyphen/>
-      </w:r>
-      <w:r>
-        <w:t xml:space="preserve">202.3—4.5</w:t>
-      </w:r>
-      <w:r>
-        <w:t xml:space="preserve"> </w:t>
-      </w:r>
-      <w:r>
-        <w:t xml:space="preserve">days for every 30 days served (ESC</w:t>
-      </w:r>
-      <w:r>
-        <w:noBreakHyphen/>
-      </w:r>
-      <w:r>
-        <w:t xml:space="preserve">1 system). Code § 53.1</w:t>
-      </w:r>
-      <w:r>
-        <w:noBreakHyphen/>
-      </w:r>
-      <w:r>
-        <w:t xml:space="preserve">202.3;</w:t>
-      </w:r>
-      <w:r>
-        <w:t xml:space="preserve"> </w:t>
-      </w:r>
-      <w:r>
-        <w:t xml:space="preserve">Shiflett Aff. ¶ 11, Enclosure F. The General Assembly chose to retain the previous maximum for the offenses included in subsection (A), which are more serious, primarily violent felonies such as murder, robbery, kidnapping, and rape. See Code § 53.1</w:t>
-      </w:r>
-      <w:r>
-        <w:noBreakHyphen/>
-      </w:r>
-      <w:r>
-        <w:t xml:space="preserve">202.3(A)⁠(1)–(17).</w:t>
-      </w:r>
-    </w:p>
-    <w:p>
-      <w:pPr>
-        <w:pStyle w:val="BodyText"/>
-      </w:pPr>
-      <w:r>
-        <w:t xml:space="preserve">Inmates serving sentences for crimes</w:t>
-      </w:r>
-      <w:r>
-        <w:t xml:space="preserve"> </w:t>
-      </w:r>
-      <w:r>
-        <w:rPr>
-          <w:i/>
-          <w:iCs/>
-        </w:rPr>
-        <w:t xml:space="preserve">not</w:t>
-      </w:r>
-      <w:r>
-        <w:t xml:space="preserve"> </w:t>
-      </w:r>
-      <w:r>
-        <w:t xml:space="preserve">included in subsection (A), by contrast, are eligible to earn sentence credit under the new four-tier classification system set forth in subsection (B) and can earn a maximum of 15 days for every 30 days served (ESC</w:t>
-      </w:r>
-      <w:r>
-        <w:noBreakHyphen/>
-      </w:r>
-      <w:r>
-        <w:t xml:space="preserve">2 system). Code § 53.1</w:t>
-      </w:r>
-      <w:r>
-        <w:noBreakHyphen/>
-      </w:r>
-      <w:r>
-        <w:t xml:space="preserve">202.3;</w:t>
-      </w:r>
-      <w:r>
-        <w:t xml:space="preserve"> </w:t>
-      </w:r>
-      <w:r>
-        <w:t xml:space="preserve">Shiflett Aff. ¶ 11, Enclosure F. The offenses covered by the new four-tier classification system are primarily less serious, non-violent felonies such as all drug offenses. Thus, the statute increased the rate at which inmates with less serious felonies could earn early release by demonstrating good conduct, while protecting the public from premature release of dangerous violent felons by continuing to restrict the amount of credits they are eligible to earn to the previous maximum of 4.5 days of credit per 30 days served. Code § 53.1</w:t>
-      </w:r>
-      <w:r>
-        <w:noBreakHyphen/>
-      </w:r>
-      <w:r>
-        <w:t xml:space="preserve">202.3.</w:t>
+        <w:t xml:space="preserve">2 system). Code § 53.1-⁠202.3;</w:t>
+      </w:r>
+      <w:r>
+        <w:t xml:space="preserve"> </w:t>
+      </w:r>
+      <w:r>
+        <w:t xml:space="preserve">Shiflett Aff. ¶ 11, Enclosure F. The offenses covered by the new four-tier classification system are primarily less serious, non-violent felonies such as all drug offenses. Thus, the statute increased the rate at which inmates with less serious felonies could earn early release by demonstrating good conduct, while protecting the public from premature release of dangerous violent felons by continuing to restrict the amount of credits they are eligible to earn to the previous maximum of 4.5 days of credit per 30 days served. Code § 53.1-⁠202.3.</w:t>
       </w:r>
     </w:p>
     <w:p>
@@ -4202,13 +4120,7 @@
         <w:tab/>
       </w:r>
       <w:r>
-        <w:t xml:space="preserve">Attempted Aggravated Murder of a Law Enforcement Officer in violation of Code § 18.2</w:t>
-      </w:r>
-      <w:r>
-        <w:noBreakHyphen/>
-      </w:r>
-      <w:r>
-        <w:t xml:space="preserve">31(6)</w:t>
+        <w:t xml:space="preserve">Attempted Aggravated Murder of a Law Enforcement Officer in violation of Code § 18.2-⁠31(6)</w:t>
       </w:r>
     </w:p>
     <w:p>
@@ -4222,13 +4134,7 @@
         <w:tab/>
       </w:r>
       <w:r>
-        <w:t xml:space="preserve">Attempted Aggravated Murder of a Law Enforcement Officer in violation of Code § 18.2</w:t>
-      </w:r>
-      <w:r>
-        <w:noBreakHyphen/>
-      </w:r>
-      <w:r>
-        <w:t xml:space="preserve">31(6)</w:t>
+        <w:t xml:space="preserve">Attempted Aggravated Murder of a Law Enforcement Officer in violation of Code § 18.2-⁠31(6)</w:t>
       </w:r>
     </w:p>
     <w:p>
@@ -4242,13 +4148,7 @@
         <w:tab/>
       </w:r>
       <w:r>
-        <w:t xml:space="preserve">Use of a Firearm during the Commission of Felony in violation of Code § 18.2</w:t>
-      </w:r>
-      <w:r>
-        <w:noBreakHyphen/>
-      </w:r>
-      <w:r>
-        <w:t xml:space="preserve">53.1</w:t>
+        <w:t xml:space="preserve">Use of a Firearm during the Commission of Felony in violation of Code § 18.2-⁠53.1</w:t>
       </w:r>
     </w:p>
     <w:p>
@@ -4262,13 +4162,7 @@
         <w:tab/>
       </w:r>
       <w:r>
-        <w:t xml:space="preserve">Misdemeanor Assault &amp; Battery of a Family Member in violation of Code § 18.2</w:t>
-      </w:r>
-      <w:r>
-        <w:noBreakHyphen/>
-      </w:r>
-      <w:r>
-        <w:t xml:space="preserve">57.2(A)</w:t>
+        <w:t xml:space="preserve">Misdemeanor Assault &amp; Battery of a Family Member in violation of Code § 18.2-⁠57.2(A)</w:t>
       </w:r>
     </w:p>
     <w:p>
@@ -4436,9 +4330,7 @@
           <w:b/>
           <w:bCs/>
         </w:rPr>
-        <w:t xml:space="preserve">53.1</w:t>
-        <w:noBreakHyphen/>
-        <w:t xml:space="preserve">202.3(A)</w:t>
+        <w:t xml:space="preserve">53.1-⁠202.3(A)</w:t>
       </w:r>
       <w:r>
         <w:rPr>
@@ -4873,13 +4765,7 @@
         <w:pStyle w:val="BodyText"/>
       </w:pPr>
       <w:r>
-        <w:t xml:space="preserve">Here, Code § 53.1</w:t>
-      </w:r>
-      <w:r>
-        <w:noBreakHyphen/>
-      </w:r>
-      <w:r>
-        <w:t xml:space="preserve">202.3(A)</w:t>
+        <w:t xml:space="preserve">Here, Code § 53.1-⁠202.3(A)</w:t>
       </w:r>
       <w:r>
         <w:t xml:space="preserve"> </w:t>
@@ -4898,13 +4784,7 @@
         <w:t xml:space="preserve"> </w:t>
       </w:r>
       <w:r>
-        <w:t xml:space="preserve">violation of § 18.2</w:t>
-      </w:r>
-      <w:r>
-        <w:noBreakHyphen/>
-      </w:r>
-      <w:r>
-        <w:t xml:space="preserve">32,” the aggravated murder statute, is ineligible for enhanced good time credits. (Emphasis added). “[T]he word ‘any’ has an expansive meaning, that is, ‘one or some indiscriminately of whatever kind.’”</w:t>
+        <w:t xml:space="preserve">violation of § 18.2-⁠32,” the aggravated murder statute, is ineligible for enhanced good time credits. (Emphasis added). “[T]he word ‘any’ has an expansive meaning, that is, ‘one or some indiscriminately of whatever kind.’”</w:t>
       </w:r>
       <w:r>
         <w:t xml:space="preserve"> </w:t>
@@ -4971,13 +4851,7 @@
         <w:t xml:space="preserve"> </w:t>
       </w:r>
       <w:r>
-        <w:t xml:space="preserve">506 (2020). While Code § 18.2</w:t>
-      </w:r>
-      <w:r>
-        <w:noBreakHyphen/>
-      </w:r>
-      <w:r>
-        <w:t xml:space="preserve">26</w:t>
+        <w:t xml:space="preserve">506 (2020). While Code § 18.2-⁠26</w:t>
       </w:r>
       <w:r>
         <w:t xml:space="preserve"> </w:t>
@@ -5015,19 +4889,13 @@
         <w:t xml:space="preserve"> </w:t>
       </w:r>
       <w:r>
-        <w:t xml:space="preserve">528, 533 (2002) (“Code § 18.2</w:t>
-      </w:r>
-      <w:r>
-        <w:noBreakHyphen/>
-      </w:r>
-      <w:r>
-        <w:t xml:space="preserve">31(6)</w:t>
-      </w:r>
-      <w:r>
-        <w:t xml:space="preserve"> </w:t>
-      </w:r>
-      <w:r>
-        <w:t xml:space="preserve">[criminalizes] the willful, deliberate, and premeditated killing of a law-enforcement officer . . . To prove an attempt of that offense, the Commonwealth must establish beyond a reasonable doubt that (1) the accused had the intent to commit capital murder and (2) made “some direct, but ineffectual, act toward its commission. . .”).</w:t>
+        <w:t xml:space="preserve">528, 533 (2002) (“Code § 18.2-⁠31(6)</w:t>
+      </w:r>
+      <w:r>
+        <w:t xml:space="preserve"> </w:t>
+      </w:r>
+      <w:r>
+        <w:t xml:space="preserve">[criminalizes] the willful, deliberate, and premeditated killing of a law-enforcement officer . . . To prove an attempt of that offense, the Commonwealth must establish beyond a reasonable doubt that (1) the accused had the intent to commit capital murder and (2) made “some direct, but ineffectual, act toward its commission. . .”).</w:t>
       </w:r>
     </w:p>
     <w:p>
@@ -5091,13 +4959,7 @@
         <w:t xml:space="preserve"> </w:t>
       </w:r>
       <w:r>
-        <w:t xml:space="preserve">Construing Code § 53.1</w:t>
-      </w:r>
-      <w:r>
-        <w:noBreakHyphen/>
-      </w:r>
-      <w:r>
-        <w:t xml:space="preserve">202.3(A)</w:t>
+        <w:t xml:space="preserve">Construing Code § 53.1-⁠202.3(A)</w:t>
       </w:r>
       <w:r>
         <w:t xml:space="preserve"> </w:t>
@@ -5111,13 +4973,7 @@
         <w:pStyle w:val="BodyText"/>
       </w:pPr>
       <w:r>
-        <w:t xml:space="preserve">Petitioner suggests that a plain reading of the text of Code § 53.1</w:t>
-      </w:r>
-      <w:r>
-        <w:noBreakHyphen/>
-      </w:r>
-      <w:r>
-        <w:t xml:space="preserve">202.3(A)</w:t>
+        <w:t xml:space="preserve">Petitioner suggests that a plain reading of the text of Code § 53.1-⁠202.3(A)</w:t>
       </w:r>
       <w:r>
         <w:t xml:space="preserve"> </w:t>
@@ -5155,13 +5011,7 @@
         <w:t xml:space="preserve">supra</w:t>
       </w:r>
       <w:r>
-        <w:t xml:space="preserve">. Aggravated attempted murder is plainly a serious violent felony. It is, indeed, an attempt to commit a murder for which the Commonwealth prescribed the death penalty until 2021. Code § 18.2</w:t>
-      </w:r>
-      <w:r>
-        <w:noBreakHyphen/>
-      </w:r>
-      <w:r>
-        <w:t xml:space="preserve">31(2020).</w:t>
+        <w:t xml:space="preserve">. Aggravated attempted murder is plainly a serious violent felony. It is, indeed, an attempt to commit a murder for which the Commonwealth prescribed the death penalty until 2021. Code § 18.2-⁠31(2020).</w:t>
       </w:r>
       <w:r>
         <w:t xml:space="preserve"> </w:t>
@@ -5213,25 +5063,13 @@
         <w:t xml:space="preserve"> </w:t>
       </w:r>
       <w:r>
-        <w:t xml:space="preserve">866, 869 (1981) (stating that we “presume that the General Assembly does not intend the application of a statute to lead to irrational consequences”). Code § 53.1</w:t>
-      </w:r>
-      <w:r>
-        <w:noBreakHyphen/>
-      </w:r>
-      <w:r>
-        <w:t xml:space="preserve">202.3(A)⁠(2)</w:t>
-      </w:r>
-      <w:r>
-        <w:t xml:space="preserve"> </w:t>
-      </w:r>
-      <w:r>
-        <w:t xml:space="preserve">lists “[s]olicitation to commit murder under § 18.2</w:t>
-      </w:r>
-      <w:r>
-        <w:noBreakHyphen/>
-      </w:r>
-      <w:r>
-        <w:t xml:space="preserve">29” as an offense that is ineligible for enhanced credits. Yet solicitation is plainly a less serious and dangerous crime than attempt, requiring only an attempt to incite another to commit the underlying offense, rather than actual overt acts by the defendant towards carrying out the underlying offense. See</w:t>
+        <w:t xml:space="preserve">866, 869 (1981) (stating that we “presume that the General Assembly does not intend the application of a statute to lead to irrational consequences”). Code § 53.1-⁠202.3(A)⁠(2)</w:t>
+      </w:r>
+      <w:r>
+        <w:t xml:space="preserve"> </w:t>
+      </w:r>
+      <w:r>
+        <w:t xml:space="preserve">lists “[s]olicitation to commit murder under § 18.2-⁠29” as an offense that is ineligible for enhanced credits. Yet solicitation is plainly a less serious and dangerous crime than attempt, requiring only an attempt to incite another to commit the underlying offense, rather than actual overt acts by the defendant towards carrying out the underlying offense. See</w:t>
       </w:r>
       <w:r>
         <w:t xml:space="preserve"> </w:t>
@@ -5322,49 +5160,25 @@
         <w:pStyle w:val="BodyText"/>
       </w:pPr>
       <w:r>
-        <w:t xml:space="preserve">Other features of the ESC system demonstrate the irrationality of petitioner’s reading. An inmate sentenced to two of the offenses enumerated in Code § 53.1</w:t>
-      </w:r>
-      <w:r>
-        <w:noBreakHyphen/>
-      </w:r>
-      <w:r>
-        <w:t xml:space="preserve">202.3(A)⁠(17)</w:t>
-      </w:r>
-      <w:r>
-        <w:t xml:space="preserve"> </w:t>
-      </w:r>
-      <w:r>
-        <w:t xml:space="preserve">is flatly ineligible for earned enhanced sentence credits. Such offenses include two convictions for breaking and entering a dwelling house with intent to commit misdemeanors, Code § 53.1</w:t>
-      </w:r>
-      <w:r>
-        <w:noBreakHyphen/>
-      </w:r>
-      <w:r>
-        <w:t xml:space="preserve">202.3(A)⁠(17)⁠(g);</w:t>
-      </w:r>
-      <w:r>
-        <w:t xml:space="preserve"> </w:t>
-      </w:r>
-      <w:r>
-        <w:t xml:space="preserve">burning an object on a highway with the intent to intimidate, Code § 53.1</w:t>
-      </w:r>
-      <w:r>
-        <w:noBreakHyphen/>
-      </w:r>
-      <w:r>
-        <w:t xml:space="preserve">202.3(A)⁠(17)⁠(i);</w:t>
-      </w:r>
-      <w:r>
-        <w:t xml:space="preserve"> </w:t>
-      </w:r>
-      <w:r>
-        <w:t xml:space="preserve">and withholding wages, Code § 53.1</w:t>
-      </w:r>
-      <w:r>
-        <w:noBreakHyphen/>
-      </w:r>
-      <w:r>
-        <w:t xml:space="preserve">202.3(A)⁠(17)⁠(j).</w:t>
+        <w:t xml:space="preserve">Other features of the ESC system demonstrate the irrationality of petitioner’s reading. An inmate sentenced to two of the offenses enumerated in Code § 53.1-⁠202.3(A)⁠(17)</w:t>
+      </w:r>
+      <w:r>
+        <w:t xml:space="preserve"> </w:t>
+      </w:r>
+      <w:r>
+        <w:t xml:space="preserve">is flatly ineligible for earned enhanced sentence credits. Such offenses include two convictions for breaking and entering a dwelling house with intent to commit misdemeanors, Code § 53.1-⁠202.3(A)⁠(17)⁠(g);</w:t>
+      </w:r>
+      <w:r>
+        <w:t xml:space="preserve"> </w:t>
+      </w:r>
+      <w:r>
+        <w:t xml:space="preserve">burning an object on a highway with the intent to intimidate, Code § 53.1-⁠202.3(A)⁠(17)⁠(i);</w:t>
+      </w:r>
+      <w:r>
+        <w:t xml:space="preserve"> </w:t>
+      </w:r>
+      <w:r>
+        <w:t xml:space="preserve">and withholding wages, Code § 53.1-⁠202.3(A)⁠(17)⁠(j).</w:t>
       </w:r>
       <w:r>
         <w:t xml:space="preserve"> </w:t>
@@ -5415,25 +5229,13 @@
         <w:pStyle w:val="BodyText"/>
       </w:pPr>
       <w:r>
-        <w:t xml:space="preserve">Reading Code § 53.1</w:t>
-      </w:r>
-      <w:r>
-        <w:noBreakHyphen/>
-      </w:r>
-      <w:r>
-        <w:t xml:space="preserve">202.3</w:t>
-      </w:r>
-      <w:r>
-        <w:t xml:space="preserve"> </w:t>
-      </w:r>
-      <w:r>
-        <w:t xml:space="preserve">in its entirety, and in light of related statutes, an individual who willfully and intentionally attempts to commit aggravated murder, but by luck or happenstance is unsuccessful in completing his endeavor, does not receive the benefit of enhanced earned sentence credit. Convictions for attempted aggravated murder, such as Petitioner’s, are included in the scope of Code § 53.1</w:t>
-      </w:r>
-      <w:r>
-        <w:noBreakHyphen/>
-      </w:r>
-      <w:r>
-        <w:t xml:space="preserve">202.3(A)</w:t>
+        <w:t xml:space="preserve">Reading Code § 53.1-⁠202.3</w:t>
+      </w:r>
+      <w:r>
+        <w:t xml:space="preserve"> </w:t>
+      </w:r>
+      <w:r>
+        <w:t xml:space="preserve">in its entirety, and in light of related statutes, an individual who willfully and intentionally attempts to commit aggravated murder, but by luck or happenstance is unsuccessful in completing his endeavor, does not receive the benefit of enhanced earned sentence credit. Convictions for attempted aggravated murder, such as Petitioner’s, are included in the scope of Code § 53.1-⁠202.3(A)</w:t>
       </w:r>
       <w:r>
         <w:t xml:space="preserve"> </w:t>
@@ -5677,496 +5479,440 @@
           <w:b/>
           <w:bCs/>
         </w:rPr>
-        <w:t xml:space="preserve">53.1</w:t>
+        <w:t xml:space="preserve">53.1-⁠202.3(A)</w:t>
+      </w:r>
+      <w:r>
+        <w:rPr>
+          <w:b/>
+          <w:bCs/>
+        </w:rPr>
+        <w:t xml:space="preserve"> </w:t>
+      </w:r>
+      <w:r>
+        <w:rPr>
+          <w:b/>
+          <w:bCs/>
+        </w:rPr>
+        <w:t xml:space="preserve">does</w:t>
+      </w:r>
+      <w:r>
+        <w:rPr>
+          <w:b/>
+          <w:bCs/>
+        </w:rPr>
+        <w:t xml:space="preserve"> </w:t>
+      </w:r>
+      <w:r>
+        <w:rPr>
+          <w:b/>
+          <w:bCs/>
+        </w:rPr>
+        <w:t xml:space="preserve">not</w:t>
+      </w:r>
+      <w:r>
+        <w:rPr>
+          <w:b/>
+          <w:bCs/>
+        </w:rPr>
+        <w:t xml:space="preserve"> </w:t>
+      </w:r>
+      <w:r>
+        <w:rPr>
+          <w:b/>
+          <w:bCs/>
+        </w:rPr>
+        <w:t xml:space="preserve">reflect</w:t>
+      </w:r>
+      <w:r>
+        <w:rPr>
+          <w:b/>
+          <w:bCs/>
+        </w:rPr>
+        <w:t xml:space="preserve"> </w:t>
+      </w:r>
+      <w:r>
+        <w:rPr>
+          <w:b/>
+          <w:bCs/>
+        </w:rPr>
+        <w:t xml:space="preserve">an</w:t>
+      </w:r>
+      <w:r>
+        <w:rPr>
+          <w:b/>
+          <w:bCs/>
+        </w:rPr>
+        <w:t xml:space="preserve"> </w:t>
+      </w:r>
+      <w:r>
+        <w:rPr>
+          <w:b/>
+          <w:bCs/>
+        </w:rPr>
+        <w:t xml:space="preserve">intent</w:t>
+      </w:r>
+      <w:r>
+        <w:rPr>
+          <w:b/>
+          <w:bCs/>
+        </w:rPr>
+        <w:t xml:space="preserve"> </w:t>
+      </w:r>
+      <w:r>
+        <w:rPr>
+          <w:b/>
+          <w:bCs/>
+        </w:rPr>
+        <w:t xml:space="preserve">to</w:t>
+      </w:r>
+      <w:r>
+        <w:rPr>
+          <w:b/>
+          <w:bCs/>
+        </w:rPr>
+        <w:t xml:space="preserve"> </w:t>
+      </w:r>
+      <w:r>
+        <w:rPr>
+          <w:b/>
+          <w:bCs/>
+        </w:rPr>
+        <w:t xml:space="preserve">exclude</w:t>
+      </w:r>
+      <w:r>
+        <w:rPr>
+          <w:b/>
+          <w:bCs/>
+        </w:rPr>
+        <w:t xml:space="preserve"> </w:t>
+      </w:r>
+      <w:r>
+        <w:rPr>
+          <w:b/>
+          <w:bCs/>
+        </w:rPr>
+        <w:t xml:space="preserve">inchoate</w:t>
+      </w:r>
+      <w:r>
+        <w:rPr>
+          <w:b/>
+          <w:bCs/>
+        </w:rPr>
+        <w:t xml:space="preserve"> </w:t>
+      </w:r>
+      <w:r>
+        <w:rPr>
+          <w:b/>
+          <w:bCs/>
+        </w:rPr>
+        <w:t xml:space="preserve">offenses</w:t>
+      </w:r>
+      <w:r>
+        <w:rPr>
+          <w:b/>
+          <w:bCs/>
+        </w:rPr>
+        <w:t xml:space="preserve"> </w:t>
+      </w:r>
+      <w:r>
+        <w:rPr>
+          <w:b/>
+          <w:bCs/>
+        </w:rPr>
+        <w:t xml:space="preserve">of</w:t>
+      </w:r>
+      <w:r>
+        <w:rPr>
+          <w:b/>
+          <w:bCs/>
+        </w:rPr>
+        <w:t xml:space="preserve"> </w:t>
+      </w:r>
+      <w:r>
+        <w:rPr>
+          <w:b/>
+          <w:bCs/>
+        </w:rPr>
+        <w:t xml:space="preserve">enumerated</w:t>
+      </w:r>
+      <w:r>
+        <w:rPr>
+          <w:b/>
+          <w:bCs/>
+        </w:rPr>
+        <w:t xml:space="preserve"> </w:t>
+      </w:r>
+      <w:r>
+        <w:rPr>
+          <w:b/>
+          <w:bCs/>
+        </w:rPr>
+        <w:t xml:space="preserve">completed</w:t>
+      </w:r>
+      <w:r>
+        <w:rPr>
+          <w:b/>
+          <w:bCs/>
+        </w:rPr>
+        <w:t xml:space="preserve"> </w:t>
+      </w:r>
+      <w:r>
+        <w:rPr>
+          <w:b/>
+          <w:bCs/>
+        </w:rPr>
+        <w:t xml:space="preserve">offenses,</w:t>
+      </w:r>
+      <w:r>
+        <w:rPr>
+          <w:b/>
+          <w:bCs/>
+        </w:rPr>
+        <w:t xml:space="preserve"> </w:t>
+      </w:r>
+      <w:r>
+        <w:rPr>
+          <w:b/>
+          <w:bCs/>
+        </w:rPr>
+        <w:t xml:space="preserve">nor</w:t>
+      </w:r>
+      <w:r>
+        <w:rPr>
+          <w:b/>
+          <w:bCs/>
+        </w:rPr>
+        <w:t xml:space="preserve"> </w:t>
+      </w:r>
+      <w:r>
+        <w:rPr>
+          <w:b/>
+          <w:bCs/>
+        </w:rPr>
+        <w:t xml:space="preserve">does</w:t>
+      </w:r>
+      <w:r>
+        <w:rPr>
+          <w:b/>
+          <w:bCs/>
+        </w:rPr>
+        <w:t xml:space="preserve"> </w:t>
+      </w:r>
+      <w:r>
+        <w:rPr>
+          <w:b/>
+          <w:bCs/>
+        </w:rPr>
+        <w:t xml:space="preserve">it</w:t>
+      </w:r>
+      <w:r>
+        <w:rPr>
+          <w:b/>
+          <w:bCs/>
+        </w:rPr>
+        <w:t xml:space="preserve"> </w:t>
+      </w:r>
+      <w:r>
+        <w:rPr>
+          <w:b/>
+          <w:bCs/>
+        </w:rPr>
+        <w:t xml:space="preserve">render</w:t>
+      </w:r>
+      <w:r>
+        <w:rPr>
+          <w:b/>
+          <w:bCs/>
+        </w:rPr>
+        <w:t xml:space="preserve"> </w:t>
+      </w:r>
+      <w:r>
+        <w:rPr>
+          <w:b/>
+          <w:bCs/>
+        </w:rPr>
+        <w:t xml:space="preserve">the</w:t>
+      </w:r>
+      <w:r>
+        <w:rPr>
+          <w:b/>
+          <w:bCs/>
+        </w:rPr>
+        <w:t xml:space="preserve"> </w:t>
+      </w:r>
+      <w:r>
+        <w:rPr>
+          <w:b/>
+          <w:bCs/>
+        </w:rPr>
+        <w:t xml:space="preserve">inclusion</w:t>
+      </w:r>
+      <w:r>
+        <w:rPr>
+          <w:b/>
+          <w:bCs/>
+        </w:rPr>
+        <w:t xml:space="preserve"> </w:t>
+      </w:r>
+      <w:r>
+        <w:rPr>
+          <w:b/>
+          <w:bCs/>
+        </w:rPr>
+        <w:t xml:space="preserve">of</w:t>
+      </w:r>
+      <w:r>
+        <w:rPr>
+          <w:b/>
+          <w:bCs/>
+        </w:rPr>
+        <w:t xml:space="preserve"> </w:t>
+      </w:r>
+      <w:r>
+        <w:rPr>
+          <w:b/>
+          <w:bCs/>
+        </w:rPr>
+        <w:t xml:space="preserve">those</w:t>
+      </w:r>
+      <w:r>
+        <w:rPr>
+          <w:b/>
+          <w:bCs/>
+        </w:rPr>
+        <w:t xml:space="preserve"> </w:t>
+      </w:r>
+      <w:r>
+        <w:rPr>
+          <w:b/>
+          <w:bCs/>
+        </w:rPr>
+        <w:t xml:space="preserve">meaningless</w:t>
+      </w:r>
+      <w:r>
+        <w:rPr>
+          <w:b/>
+          <w:bCs/>
+        </w:rPr>
+        <w:t xml:space="preserve"> </w:t>
+      </w:r>
+      <w:r>
+        <w:rPr>
+          <w:b/>
+          <w:bCs/>
+        </w:rPr>
+        <w:t xml:space="preserve">and</w:t>
+      </w:r>
+      <w:r>
+        <w:rPr>
+          <w:b/>
+          <w:bCs/>
+        </w:rPr>
+        <w:t xml:space="preserve"> </w:t>
+      </w:r>
+      <w:r>
+        <w:rPr>
+          <w:b/>
+          <w:bCs/>
+        </w:rPr>
+        <w:t xml:space="preserve">superfluous</w:t>
+      </w:r>
+    </w:p>
+    <w:p>
+      <w:pPr>
+        <w:pStyle w:val="BodyText"/>
+      </w:pPr>
+      <w:r>
+        <w:t xml:space="preserve">Petitioner’s argument that Code § 53.1-⁠202.3(A)’s</w:t>
+      </w:r>
+      <w:r>
+        <w:t xml:space="preserve"> </w:t>
+      </w:r>
+      <w:r>
+        <w:t xml:space="preserve">express reference to certain inchoate offenses demonstrates that the General Assembly did not intend to include any other inchoate offenses also fails. Pet.’s Mem. Supp. at 13–16. Again, the Code of Virginia does not separately enumerate most inchoate offenses; instead, they are treated as types of violations of the underlying offense. See Argument Section I,</w:t>
+      </w:r>
+      <w:r>
+        <w:t xml:space="preserve"> </w:t>
+      </w:r>
+      <w:r>
+        <w:rPr>
+          <w:i/>
+          <w:iCs/>
+        </w:rPr>
+        <w:t xml:space="preserve">supra</w:t>
+      </w:r>
+      <w:r>
+        <w:t xml:space="preserve">. The General Assembly has, however, separately enumerated certain inchoate offenses. The fact that the General Assembly separately included such enumerated inchoate offenses only further undermines Petitioner’s interpretation, by demonstrating that the General Assembly did not intend to allow enhanced credits for inchoate crimes that are serious violent felonies.</w:t>
+      </w:r>
+    </w:p>
+    <w:p>
+      <w:pPr>
+        <w:pStyle w:val="BodyText"/>
+      </w:pPr>
+      <w:r>
+        <w:t xml:space="preserve">Generally, an attempt, solicitation, or conspiracy to commit completed offenses are not defined independently from the completed offense. Rather the Code provides only how attempts, solicitation, and conspiracy to commit completed crimes defined in Title 18.2 should be punished in relation to the classification of the completed criminal offense. See generally Code §§ 18.2-⁠22 through 18.2</w:t>
+      </w:r>
+      <w:r>
         <w:noBreakHyphen/>
-        <w:t xml:space="preserve">202.3(A)</w:t>
-      </w:r>
-      <w:r>
-        <w:rPr>
-          <w:b/>
-          <w:bCs/>
-        </w:rPr>
-        <w:t xml:space="preserve"> </w:t>
-      </w:r>
-      <w:r>
-        <w:rPr>
-          <w:b/>
-          <w:bCs/>
-        </w:rPr>
-        <w:t xml:space="preserve">does</w:t>
-      </w:r>
-      <w:r>
-        <w:rPr>
-          <w:b/>
-          <w:bCs/>
-        </w:rPr>
-        <w:t xml:space="preserve"> </w:t>
-      </w:r>
-      <w:r>
-        <w:rPr>
-          <w:b/>
-          <w:bCs/>
-        </w:rPr>
-        <w:t xml:space="preserve">not</w:t>
-      </w:r>
-      <w:r>
-        <w:rPr>
-          <w:b/>
-          <w:bCs/>
-        </w:rPr>
-        <w:t xml:space="preserve"> </w:t>
-      </w:r>
-      <w:r>
-        <w:rPr>
-          <w:b/>
-          <w:bCs/>
-        </w:rPr>
-        <w:t xml:space="preserve">reflect</w:t>
-      </w:r>
-      <w:r>
-        <w:rPr>
-          <w:b/>
-          <w:bCs/>
-        </w:rPr>
-        <w:t xml:space="preserve"> </w:t>
-      </w:r>
-      <w:r>
-        <w:rPr>
-          <w:b/>
-          <w:bCs/>
-        </w:rPr>
-        <w:t xml:space="preserve">an</w:t>
-      </w:r>
-      <w:r>
-        <w:rPr>
-          <w:b/>
-          <w:bCs/>
-        </w:rPr>
-        <w:t xml:space="preserve"> </w:t>
-      </w:r>
-      <w:r>
-        <w:rPr>
-          <w:b/>
-          <w:bCs/>
-        </w:rPr>
-        <w:t xml:space="preserve">intent</w:t>
-      </w:r>
-      <w:r>
-        <w:rPr>
-          <w:b/>
-          <w:bCs/>
-        </w:rPr>
-        <w:t xml:space="preserve"> </w:t>
-      </w:r>
-      <w:r>
-        <w:rPr>
-          <w:b/>
-          <w:bCs/>
-        </w:rPr>
-        <w:t xml:space="preserve">to</w:t>
-      </w:r>
-      <w:r>
-        <w:rPr>
-          <w:b/>
-          <w:bCs/>
-        </w:rPr>
-        <w:t xml:space="preserve"> </w:t>
-      </w:r>
-      <w:r>
-        <w:rPr>
-          <w:b/>
-          <w:bCs/>
-        </w:rPr>
-        <w:t xml:space="preserve">exclude</w:t>
-      </w:r>
-      <w:r>
-        <w:rPr>
-          <w:b/>
-          <w:bCs/>
-        </w:rPr>
-        <w:t xml:space="preserve"> </w:t>
-      </w:r>
-      <w:r>
-        <w:rPr>
-          <w:b/>
-          <w:bCs/>
-        </w:rPr>
-        <w:t xml:space="preserve">inchoate</w:t>
-      </w:r>
-      <w:r>
-        <w:rPr>
-          <w:b/>
-          <w:bCs/>
-        </w:rPr>
-        <w:t xml:space="preserve"> </w:t>
-      </w:r>
-      <w:r>
-        <w:rPr>
-          <w:b/>
-          <w:bCs/>
-        </w:rPr>
-        <w:t xml:space="preserve">offenses</w:t>
-      </w:r>
-      <w:r>
-        <w:rPr>
-          <w:b/>
-          <w:bCs/>
-        </w:rPr>
-        <w:t xml:space="preserve"> </w:t>
-      </w:r>
-      <w:r>
-        <w:rPr>
-          <w:b/>
-          <w:bCs/>
-        </w:rPr>
-        <w:t xml:space="preserve">of</w:t>
-      </w:r>
-      <w:r>
-        <w:rPr>
-          <w:b/>
-          <w:bCs/>
-        </w:rPr>
-        <w:t xml:space="preserve"> </w:t>
-      </w:r>
-      <w:r>
-        <w:rPr>
-          <w:b/>
-          <w:bCs/>
-        </w:rPr>
-        <w:t xml:space="preserve">enumerated</w:t>
-      </w:r>
-      <w:r>
-        <w:rPr>
-          <w:b/>
-          <w:bCs/>
-        </w:rPr>
-        <w:t xml:space="preserve"> </w:t>
-      </w:r>
-      <w:r>
-        <w:rPr>
-          <w:b/>
-          <w:bCs/>
-        </w:rPr>
-        <w:t xml:space="preserve">completed</w:t>
-      </w:r>
-      <w:r>
-        <w:rPr>
-          <w:b/>
-          <w:bCs/>
-        </w:rPr>
-        <w:t xml:space="preserve"> </w:t>
-      </w:r>
-      <w:r>
-        <w:rPr>
-          <w:b/>
-          <w:bCs/>
-        </w:rPr>
-        <w:t xml:space="preserve">offenses,</w:t>
-      </w:r>
-      <w:r>
-        <w:rPr>
-          <w:b/>
-          <w:bCs/>
-        </w:rPr>
-        <w:t xml:space="preserve"> </w:t>
-      </w:r>
-      <w:r>
-        <w:rPr>
-          <w:b/>
-          <w:bCs/>
-        </w:rPr>
-        <w:t xml:space="preserve">nor</w:t>
-      </w:r>
-      <w:r>
-        <w:rPr>
-          <w:b/>
-          <w:bCs/>
-        </w:rPr>
-        <w:t xml:space="preserve"> </w:t>
-      </w:r>
-      <w:r>
-        <w:rPr>
-          <w:b/>
-          <w:bCs/>
-        </w:rPr>
-        <w:t xml:space="preserve">does</w:t>
-      </w:r>
-      <w:r>
-        <w:rPr>
-          <w:b/>
-          <w:bCs/>
-        </w:rPr>
-        <w:t xml:space="preserve"> </w:t>
-      </w:r>
-      <w:r>
-        <w:rPr>
-          <w:b/>
-          <w:bCs/>
-        </w:rPr>
-        <w:t xml:space="preserve">it</w:t>
-      </w:r>
-      <w:r>
-        <w:rPr>
-          <w:b/>
-          <w:bCs/>
-        </w:rPr>
-        <w:t xml:space="preserve"> </w:t>
-      </w:r>
-      <w:r>
-        <w:rPr>
-          <w:b/>
-          <w:bCs/>
-        </w:rPr>
-        <w:t xml:space="preserve">render</w:t>
-      </w:r>
-      <w:r>
-        <w:rPr>
-          <w:b/>
-          <w:bCs/>
-        </w:rPr>
-        <w:t xml:space="preserve"> </w:t>
-      </w:r>
-      <w:r>
-        <w:rPr>
-          <w:b/>
-          <w:bCs/>
-        </w:rPr>
-        <w:t xml:space="preserve">the</w:t>
-      </w:r>
-      <w:r>
-        <w:rPr>
-          <w:b/>
-          <w:bCs/>
-        </w:rPr>
-        <w:t xml:space="preserve"> </w:t>
-      </w:r>
-      <w:r>
-        <w:rPr>
-          <w:b/>
-          <w:bCs/>
-        </w:rPr>
-        <w:t xml:space="preserve">inclusion</w:t>
-      </w:r>
-      <w:r>
-        <w:rPr>
-          <w:b/>
-          <w:bCs/>
-        </w:rPr>
-        <w:t xml:space="preserve"> </w:t>
-      </w:r>
-      <w:r>
-        <w:rPr>
-          <w:b/>
-          <w:bCs/>
-        </w:rPr>
-        <w:t xml:space="preserve">of</w:t>
-      </w:r>
-      <w:r>
-        <w:rPr>
-          <w:b/>
-          <w:bCs/>
-        </w:rPr>
-        <w:t xml:space="preserve"> </w:t>
-      </w:r>
-      <w:r>
-        <w:rPr>
-          <w:b/>
-          <w:bCs/>
-        </w:rPr>
-        <w:t xml:space="preserve">those</w:t>
-      </w:r>
-      <w:r>
-        <w:rPr>
-          <w:b/>
-          <w:bCs/>
-        </w:rPr>
-        <w:t xml:space="preserve"> </w:t>
-      </w:r>
-      <w:r>
-        <w:rPr>
-          <w:b/>
-          <w:bCs/>
-        </w:rPr>
-        <w:t xml:space="preserve">meaningless</w:t>
-      </w:r>
-      <w:r>
-        <w:rPr>
-          <w:b/>
-          <w:bCs/>
-        </w:rPr>
-        <w:t xml:space="preserve"> </w:t>
-      </w:r>
-      <w:r>
-        <w:rPr>
-          <w:b/>
-          <w:bCs/>
-        </w:rPr>
-        <w:t xml:space="preserve">and</w:t>
-      </w:r>
-      <w:r>
-        <w:rPr>
-          <w:b/>
-          <w:bCs/>
-        </w:rPr>
-        <w:t xml:space="preserve"> </w:t>
-      </w:r>
-      <w:r>
-        <w:rPr>
-          <w:b/>
-          <w:bCs/>
-        </w:rPr>
-        <w:t xml:space="preserve">superfluous</w:t>
-      </w:r>
-    </w:p>
-    <w:p>
-      <w:pPr>
-        <w:pStyle w:val="BodyText"/>
-      </w:pPr>
-      <w:r>
-        <w:t xml:space="preserve">Petitioner’s argument that Code § 53.1</w:t>
+      </w:r>
+      <w:r>
+        <w:t xml:space="preserve">29. For example, there is no stand-alone criminal offense titled “Attempted Murder of a Pregnant Woman” in the Code, only the completed offense of “Murder of a Pregnant Woman.” See Code § 18.2-⁠32.1.</w:t>
+      </w:r>
+      <w:r>
+        <w:t xml:space="preserve"> </w:t>
+      </w:r>
+      <w:r>
+        <w:t xml:space="preserve">Code § 18.2-⁠26</w:t>
+      </w:r>
+      <w:r>
+        <w:t xml:space="preserve"> </w:t>
+      </w:r>
+      <w:r>
+        <w:t xml:space="preserve">provides how attempts to commit all non-Class 1 felonies should be punished—including attempted Murder of a Pregnant Woman in violation of Code § 18.2-⁠32.1.</w:t>
+      </w:r>
+      <w:r>
+        <w:t xml:space="preserve"> </w:t>
+      </w:r>
+      <w:r>
+        <w:t xml:space="preserve">An individual cannot be arrested, convicted, and sentenced for a violation of Code § 18.2-⁠26</w:t>
+      </w:r>
+      <w:r>
+        <w:t xml:space="preserve"> </w:t>
+      </w:r>
+      <w:r>
+        <w:t xml:space="preserve">alone, because it alone is not a criminal offense. Consequently, the General Assembly did not specifically enumerate each of the inchoate offenses encompassed in subsection (A), because those offenses are not separately enumerated in the Virginia Code and are instead encompassed by reference to the underlying enumerated offense.</w:t>
+      </w:r>
+    </w:p>
+    <w:p>
+      <w:pPr>
+        <w:pStyle w:val="BodyTextNote"/>
+      </w:pPr>
+      <w:r>
+        <w:t xml:space="preserve">By contrast, the General Assembly has separately criminalized an attempt to engage in specific conduct. Punishment for those separately enumerated attempt offenses is not governed by Code § 18.2-⁠26.</w:t>
+      </w:r>
+      <w:r>
+        <w:t xml:space="preserve"> </w:t>
+      </w:r>
+      <w:r>
+        <w:t xml:space="preserve">For example, Code § 18.2-⁠54.1</w:t>
+      </w:r>
+      <w:r>
+        <w:t xml:space="preserve"> </w:t>
+      </w:r>
+      <w:r>
+        <w:t xml:space="preserve">defines the act and the penalty for the criminal offense of “Attempts to poison.” Subsection (A) of section 53.1</w:t>
       </w:r>
       <w:r>
         <w:noBreakHyphen/>
       </w:r>
       <w:r>
-        <w:t xml:space="preserve">202.3(A)’s</w:t>
-      </w:r>
-      <w:r>
-        <w:t xml:space="preserve"> </w:t>
-      </w:r>
-      <w:r>
-        <w:t xml:space="preserve">express reference to certain inchoate offenses demonstrates that the General Assembly did not intend to include any other inchoate offenses also fails. Pet.’s Mem. Supp. at 13–16. Again, the Code of Virginia does not separately enumerate most inchoate offenses; instead, they are treated as types of violations of the underlying offense. See Argument Section I,</w:t>
-      </w:r>
-      <w:r>
-        <w:t xml:space="preserve"> </w:t>
-      </w:r>
-      <w:r>
-        <w:rPr>
-          <w:i/>
-          <w:iCs/>
-        </w:rPr>
-        <w:t xml:space="preserve">supra</w:t>
-      </w:r>
-      <w:r>
-        <w:t xml:space="preserve">. The General Assembly has, however, separately enumerated certain inchoate offenses. The fact that the General Assembly separately included such enumerated inchoate offenses only further undermines Petitioner’s interpretation, by demonstrating that the General Assembly did not intend to allow enhanced credits for inchoate crimes that are serious violent felonies.</w:t>
-      </w:r>
-    </w:p>
-    <w:p>
-      <w:pPr>
-        <w:pStyle w:val="BodyText"/>
-      </w:pPr>
-      <w:r>
-        <w:t xml:space="preserve">Generally, an attempt, solicitation, or conspiracy to commit completed offenses are not defined independently from the completed offense. Rather the Code provides only how attempts, solicitation, and conspiracy to commit completed crimes defined in Title 18.2 should be punished in relation to the classification of the completed criminal offense. See generally Code §§ 18.2</w:t>
-      </w:r>
-      <w:r>
-        <w:noBreakHyphen/>
-      </w:r>
-      <w:r>
-        <w:t xml:space="preserve">22 through 18.2</w:t>
-      </w:r>
-      <w:r>
-        <w:noBreakHyphen/>
-      </w:r>
-      <w:r>
-        <w:t xml:space="preserve">29. For example, there is no stand-alone criminal offense titled “Attempted Murder of a Pregnant Woman” in the Code, only the completed offense of “Murder of a Pregnant Woman.” See Code § 18.2</w:t>
-      </w:r>
-      <w:r>
-        <w:noBreakHyphen/>
-      </w:r>
-      <w:r>
-        <w:t xml:space="preserve">32.1.</w:t>
-      </w:r>
-      <w:r>
-        <w:t xml:space="preserve"> </w:t>
-      </w:r>
-      <w:r>
-        <w:t xml:space="preserve">Code § 18.2</w:t>
-      </w:r>
-      <w:r>
-        <w:noBreakHyphen/>
-      </w:r>
-      <w:r>
-        <w:t xml:space="preserve">26</w:t>
-      </w:r>
-      <w:r>
-        <w:t xml:space="preserve"> </w:t>
-      </w:r>
-      <w:r>
-        <w:t xml:space="preserve">provides how attempts to commit all non-Class 1 felonies should be punished—including attempted Murder of a Pregnant Woman in violation of Code § 18.2</w:t>
-      </w:r>
-      <w:r>
-        <w:noBreakHyphen/>
-      </w:r>
-      <w:r>
-        <w:t xml:space="preserve">32.1.</w:t>
-      </w:r>
-      <w:r>
-        <w:t xml:space="preserve"> </w:t>
-      </w:r>
-      <w:r>
-        <w:t xml:space="preserve">An individual cannot be arrested, convicted, and sentenced for a violation of Code § 18.2</w:t>
-      </w:r>
-      <w:r>
-        <w:noBreakHyphen/>
-      </w:r>
-      <w:r>
-        <w:t xml:space="preserve">26</w:t>
-      </w:r>
-      <w:r>
-        <w:t xml:space="preserve"> </w:t>
-      </w:r>
-      <w:r>
-        <w:t xml:space="preserve">alone, because it alone is not a criminal offense. Consequently, the General Assembly did not specifically enumerate each of the inchoate offenses encompassed in subsection (A), because those offenses are not separately enumerated in the Virginia Code and are instead encompassed by reference to the underlying enumerated offense.</w:t>
-      </w:r>
-    </w:p>
-    <w:p>
-      <w:pPr>
-        <w:pStyle w:val="BodyTextNote"/>
-      </w:pPr>
-      <w:r>
-        <w:t xml:space="preserve">By contrast, the General Assembly has separately criminalized an attempt to engage in specific conduct. Punishment for those separately enumerated attempt offenses is not governed by Code § 18.2</w:t>
-      </w:r>
-      <w:r>
-        <w:noBreakHyphen/>
-      </w:r>
-      <w:r>
-        <w:t xml:space="preserve">26.</w:t>
-      </w:r>
-      <w:r>
-        <w:t xml:space="preserve"> </w:t>
-      </w:r>
-      <w:r>
-        <w:t xml:space="preserve">For example, Code § 18.2</w:t>
-      </w:r>
-      <w:r>
-        <w:noBreakHyphen/>
-      </w:r>
-      <w:r>
-        <w:t xml:space="preserve">54.1</w:t>
-      </w:r>
-      <w:r>
-        <w:t xml:space="preserve"> </w:t>
-      </w:r>
-      <w:r>
-        <w:t xml:space="preserve">defines the act and the penalty for the criminal offense of “Attempts to poison.” Subsection (A) of section 53.1</w:t>
-      </w:r>
-      <w:r>
-        <w:noBreakHyphen/>
-      </w:r>
-      <w:r>
         <w:t xml:space="preserve">202.3</w:t>
       </w:r>
       <w:r>
         <w:t xml:space="preserve"> </w:t>
       </w:r>
       <w:r>
-        <w:t xml:space="preserve">explicitly lists violations of Code § 18.2</w:t>
-      </w:r>
-      <w:r>
-        <w:noBreakHyphen/>
-      </w:r>
-      <w:r>
-        <w:t xml:space="preserve">54.1</w:t>
+        <w:t xml:space="preserve">explicitly lists violations of Code § 18.2-⁠54.1</w:t>
       </w:r>
       <w:r>
         <w:t xml:space="preserve"> </w:t>
@@ -6227,26 +5973,16 @@
     </w:p>
     <w:p>
       <w:pPr>
-        <w:pStyle w:val="BodyText"/>
-      </w:pPr>
-      <w:r>
-        <w:t xml:space="preserve">In accordance with Rule 5:7(b)⁠(6) of the Rules of the Supreme Court of Virginia, Respondent submits that this Court may deny and dismiss this petition as a matter of law without requiring an evidentiary hearing. See also Code § 8.01</w:t>
-      </w:r>
-      <w:r>
-        <w:noBreakHyphen/>
-      </w:r>
-      <w:r>
-        <w:t xml:space="preserve">654(B)⁠(4); Code § 8.01</w:t>
-      </w:r>
-      <w:r>
-        <w:noBreakHyphen/>
-      </w:r>
-      <w:r>
-        <w:t xml:space="preserve">695.</w:t>
-      </w:r>
-    </w:p>
-    <w:p>
-      <w:pPr>
+        <w:pStyle w:val="BodyTextKeep"/>
+      </w:pPr>
+      <w:r>
+        <w:t xml:space="preserve">In accordance with Rule 5:7(b)⁠(6) of the Rules of the Supreme Court of Virginia, Respondent submits that this Court may deny and dismiss this petition as a matter of law without requiring an evidentiary hearing. See also Code § 8.01-⁠654(B)⁠(4); Code § 8.01-⁠695.</w:t>
+      </w:r>
+    </w:p>
+    <w:p>
+      <w:pPr>
+        <w:keepNext/>
+        <w:keepLines/>
         <w:spacing w:before="0" w:after="0" w:line="336" w:lineRule="exact"/>
       </w:pPr>
     </w:p>
@@ -7625,19 +7361,13 @@
         <w:t xml:space="preserve"> </w:t>
       </w:r>
       <w:r>
-        <w:t xml:space="preserve">On April 14, 2022, and again on June 24, 2022, VDOC’s inmate population was informed by letters that were posted in every housing unit that any changes in sentence calculations resulting from the amendments to Code § 53.1</w:t>
-      </w:r>
-      <w:r>
-        <w:noBreakHyphen/>
-      </w:r>
-      <w:r>
-        <w:t xml:space="preserve">202.3</w:t>
-      </w:r>
-      <w:r>
-        <w:t xml:space="preserve"> </w:t>
-      </w:r>
-      <w:r>
-        <w:t xml:space="preserve">would not happen until July 1, 2022, and that any “effort by the counseling staff to develop home plans is the result of testing and preliminary calculations” because “audited and finalized calculations cannot occur until on and after 7/1/2022.” Shiflett Aff. ¶ 12–15, Enclosures D and E.</w:t>
+        <w:t xml:space="preserve">On April 14, 2022, and again on June 24, 2022, VDOC’s inmate population was informed by letters that were posted in every housing unit that any changes in sentence calculations resulting from the amendments to Code § 53.1-⁠202.3</w:t>
+      </w:r>
+      <w:r>
+        <w:t xml:space="preserve"> </w:t>
+      </w:r>
+      <w:r>
+        <w:t xml:space="preserve">would not happen until July 1, 2022, and that any “effort by the counseling staff to develop home plans is the result of testing and preliminary calculations” because “audited and finalized calculations cannot occur until on and after 7/1/2022.” Shiflett Aff. ¶ 12–⁠15, Enclosures D and E.</w:t>
       </w:r>
     </w:p>
   </w:footnote>
@@ -7669,109 +7399,55 @@
         <w:t xml:space="preserve">e.g.</w:t>
       </w:r>
       <w:r>
-        <w:t xml:space="preserve">, Code § 53.1</w:t>
-      </w:r>
-      <w:r>
-        <w:noBreakHyphen/>
-      </w:r>
-      <w:r>
-        <w:t xml:space="preserve">202.3(A)⁠(17)⁠(e)⁠(including</w:t>
-      </w:r>
-      <w:r>
-        <w:t xml:space="preserve"> </w:t>
-      </w:r>
-      <w:r>
-        <w:t xml:space="preserve">violations of Code § 18.2</w:t>
-      </w:r>
-      <w:r>
-        <w:noBreakHyphen/>
-      </w:r>
-      <w:r>
-        <w:t xml:space="preserve">54.1,</w:t>
-      </w:r>
-      <w:r>
-        <w:t xml:space="preserve"> </w:t>
-      </w:r>
-      <w:r>
-        <w:t xml:space="preserve">for “Attempts to poison”); Code § 53.1</w:t>
-      </w:r>
-      <w:r>
-        <w:noBreakHyphen/>
-      </w:r>
-      <w:r>
-        <w:t xml:space="preserve">202.3(A)⁠(17)⁠(d)</w:t>
-      </w:r>
-      <w:r>
-        <w:t xml:space="preserve"> </w:t>
-      </w:r>
-      <w:r>
-        <w:t xml:space="preserve">(including felony violations of Code § 18.2</w:t>
-      </w:r>
-      <w:r>
-        <w:noBreakHyphen/>
-      </w:r>
-      <w:r>
-        <w:t xml:space="preserve">46(B)</w:t>
-      </w:r>
-      <w:r>
-        <w:t xml:space="preserve"> </w:t>
-      </w:r>
-      <w:r>
-        <w:t xml:space="preserve">by any person who “conspires to commit, or aids and abets the commission of an act of terrorism,” and § 18.2</w:t>
-      </w:r>
-      <w:r>
-        <w:noBreakHyphen/>
-      </w:r>
-      <w:r>
-        <w:t xml:space="preserve">46(C)</w:t>
-      </w:r>
-      <w:r>
-        <w:t xml:space="preserve"> </w:t>
-      </w:r>
-      <w:r>
-        <w:t xml:space="preserve">by any person who “solicits, invites, recruits, encourages, or otherwise causes or attempts to cause another to participate in an act or acts of terrorism”); Code § 53.1</w:t>
-      </w:r>
-      <w:r>
-        <w:noBreakHyphen/>
-      </w:r>
-      <w:r>
-        <w:t xml:space="preserve">202.3(A)⁠(17)⁠(e)⁠(including</w:t>
-      </w:r>
-      <w:r>
-        <w:t xml:space="preserve"> </w:t>
-      </w:r>
-      <w:r>
-        <w:t xml:space="preserve">felony violations of Code § 18.2</w:t>
-      </w:r>
-      <w:r>
-        <w:noBreakHyphen/>
-      </w:r>
-      <w:r>
-        <w:t xml:space="preserve">67.5,</w:t>
-      </w:r>
-      <w:r>
-        <w:t xml:space="preserve"> </w:t>
-      </w:r>
-      <w:r>
-        <w:t xml:space="preserve">for “Attempted rape, forcible sodomy, object sexual penetration, [and] aggravated sexual battery”); Code § 53.1</w:t>
-      </w:r>
-      <w:r>
-        <w:noBreakHyphen/>
-      </w:r>
-      <w:r>
-        <w:t xml:space="preserve">202.3(A)⁠(5)⁠(for</w:t>
-      </w:r>
-      <w:r>
-        <w:t xml:space="preserve"> </w:t>
-      </w:r>
-      <w:r>
-        <w:t xml:space="preserve">felony violations of Code § 18.2</w:t>
-      </w:r>
-      <w:r>
-        <w:noBreakHyphen/>
-      </w:r>
-      <w:r>
-        <w:t xml:space="preserve">49</w:t>
+        <w:t xml:space="preserve">, Code § 53.1-⁠202.3(A)⁠(17)⁠(e)⁠(including</w:t>
+      </w:r>
+      <w:r>
+        <w:t xml:space="preserve"> </w:t>
+      </w:r>
+      <w:r>
+        <w:t xml:space="preserve">violations of Code § 18.2-⁠54.1,</w:t>
+      </w:r>
+      <w:r>
+        <w:t xml:space="preserve"> </w:t>
+      </w:r>
+      <w:r>
+        <w:t xml:space="preserve">for “Attempts to poison”); Code § 53.1-⁠202.3(A)⁠(17)⁠(d)</w:t>
+      </w:r>
+      <w:r>
+        <w:t xml:space="preserve"> </w:t>
+      </w:r>
+      <w:r>
+        <w:t xml:space="preserve">(including felony violations of Code § 18.2-⁠46(B)</w:t>
+      </w:r>
+      <w:r>
+        <w:t xml:space="preserve"> </w:t>
+      </w:r>
+      <w:r>
+        <w:t xml:space="preserve">by any person who “conspires to commit, or aids and abets the commission of an act of terrorism,” and § 18.2-⁠46(C)</w:t>
+      </w:r>
+      <w:r>
+        <w:t xml:space="preserve"> </w:t>
+      </w:r>
+      <w:r>
+        <w:t xml:space="preserve">by any person who “solicits, invites, recruits, encourages, or otherwise causes or attempts to cause another to participate in an act or acts of terrorism”); Code § 53.1-⁠202.3(A)⁠(17)⁠(e)⁠(including</w:t>
+      </w:r>
+      <w:r>
+        <w:t xml:space="preserve"> </w:t>
+      </w:r>
+      <w:r>
+        <w:t xml:space="preserve">felony violations of Code § 18.2-⁠67.5,</w:t>
+      </w:r>
+      <w:r>
+        <w:t xml:space="preserve"> </w:t>
+      </w:r>
+      <w:r>
+        <w:t xml:space="preserve">for “Attempted rape, forcible sodomy, object sexual penetration, [and] aggravated sexual battery”); Code § 53.1-⁠202.3(A)⁠(5)⁠(for</w:t>
+      </w:r>
+      <w:r>
+        <w:t xml:space="preserve"> </w:t>
+      </w:r>
+      <w:r>
+        <w:t xml:space="preserve">felony violations of Code § 18.2-⁠49</w:t>
       </w:r>
       <w:r>
         <w:t xml:space="preserve"> </w:t>
@@ -7796,25 +7472,13 @@
         <w:t xml:space="preserve"> </w:t>
       </w:r>
       <w:r>
-        <w:t xml:space="preserve">Furthermore, Petitioner’s argument highlighting differences between the lists in Code § 53.1</w:t>
-      </w:r>
-      <w:r>
-        <w:noBreakHyphen/>
-      </w:r>
-      <w:r>
-        <w:t xml:space="preserve">202.3(A)</w:t>
-      </w:r>
-      <w:r>
-        <w:t xml:space="preserve"> </w:t>
-      </w:r>
-      <w:r>
-        <w:t xml:space="preserve">and Code § 53.1</w:t>
-      </w:r>
-      <w:r>
-        <w:noBreakHyphen/>
-      </w:r>
-      <w:r>
-        <w:t xml:space="preserve">40.02(C)</w:t>
+        <w:t xml:space="preserve">Furthermore, Petitioner’s argument highlighting differences between the lists in Code § 53.1-⁠202.3(A)</w:t>
+      </w:r>
+      <w:r>
+        <w:t xml:space="preserve"> </w:t>
+      </w:r>
+      <w:r>
+        <w:t xml:space="preserve">and Code § 53.1-⁠40.02(C)</w:t>
       </w:r>
       <w:r>
         <w:t xml:space="preserve"> </w:t>
@@ -8761,6 +8425,15 @@
       <w:ind w:firstLine="0"/>
     </w:pPr>
   </w:style>
+  <w:style w:type="paragraph" w:customStyle="1" w:styleId="BodyTextKeep">
+    <w:name w:val="Body Text Keep"/>
+    <w:basedOn w:val="BodyText"/>
+    <w:qFormat/>
+    <w:pPr>
+      <w:keepNext/>
+      <w:keepLines/>
+    </w:pPr>
+  </w:style>
   <w:style w:type="paragraph" w:customStyle="1" w:styleId="XdList1">
     <w:name w:val="XdList 1"/>
     <w:basedOn w:val="Normal"/>
@@ -8813,6 +8486,33 @@
     <w:pPr>
       <w:spacing w:before="0" w:after="0" w:line="322" w:lineRule="exact"/>
       <w:ind w:left="2160" w:hanging="720"/>
+    </w:pPr>
+  </w:style>
+  <w:style w:type="paragraph" w:customStyle="1" w:styleId="XdQuoteList1">
+    <w:name w:val="Xd Quote List 1"/>
+    <w:basedOn w:val="Normal"/>
+    <w:qFormat/>
+    <w:pPr>
+      <w:spacing w:before="0" w:after="0" w:line="322" w:lineRule="exact"/>
+      <w:ind w:left="1440" w:right="720" w:hanging="720"/>
+    </w:pPr>
+  </w:style>
+  <w:style w:type="paragraph" w:customStyle="1" w:styleId="XdQuoteList2">
+    <w:name w:val="Xd Quote List 2"/>
+    <w:basedOn w:val="Normal"/>
+    <w:qFormat/>
+    <w:pPr>
+      <w:spacing w:before="0" w:after="0" w:line="322" w:lineRule="exact"/>
+      <w:ind w:left="2160" w:right="720" w:hanging="720"/>
+    </w:pPr>
+  </w:style>
+  <w:style w:type="paragraph" w:customStyle="1" w:styleId="XdQuoteList3">
+    <w:name w:val="Xd Quote List 3"/>
+    <w:basedOn w:val="Normal"/>
+    <w:qFormat/>
+    <w:pPr>
+      <w:spacing w:before="0" w:after="0" w:line="322" w:lineRule="exact"/>
+      <w:ind w:left="2880" w:right="720" w:hanging="720"/>
     </w:pPr>
   </w:style>
   <w:style w:type="paragraph" w:customStyle="1" w:styleId="XdList1">

</xml_diff>